<commit_message>
Implement build scripts for revisions v19 to v23, enhancing document updates with new references, content realignment, and formatting corrections. Key changes include: - v19: Strengthen objectives with new literature and update synthesis. - v20: Realign Objective 1.3, remove outdated references, and update synthesis. - v21: Clean up reference artifacts and preserve content changes. - v22: Alphabetize references, correct matrix mappings, and update synthesis. - v23: Remove hyperlink artifacts and ensure reference integrity.
</commit_message>
<xml_diff>
--- a/papers/AIMS/revisions/cha1&2_v18.docx
+++ b/papers/AIMS/revisions/cha1&2_v18.docx
@@ -90,25 +90,7 @@
           <w:sz w:val="24"/>
           <w:szCs w:val="24"/>
         </w:rPr>
-        <w:t xml:space="preserve">Carlos </w:t>
-      </w:r>
-      <w:proofErr w:type="spellStart"/>
-      <w:r>
-        <w:rPr>
-          <w:rFonts w:ascii="Times New Roman" w:eastAsia="Times New Roman" w:hAnsi="Times New Roman" w:cs="Times New Roman"/>
-          <w:sz w:val="24"/>
-          <w:szCs w:val="24"/>
-        </w:rPr>
-        <w:t>Hilado</w:t>
-      </w:r>
-      <w:proofErr w:type="spellEnd"/>
-      <w:r>
-        <w:rPr>
-          <w:rFonts w:ascii="Times New Roman" w:eastAsia="Times New Roman" w:hAnsi="Times New Roman" w:cs="Times New Roman"/>
-          <w:sz w:val="24"/>
-          <w:szCs w:val="24"/>
-        </w:rPr>
-        <w:t xml:space="preserve"> Memorial State University</w:t>
+        <w:t>Carlos Hilado Memorial State University</w:t>
       </w:r>
     </w:p>
     <w:p>
@@ -121,23 +103,13 @@
           <w:szCs w:val="24"/>
         </w:rPr>
       </w:pPr>
-      <w:proofErr w:type="spellStart"/>
-      <w:r>
-        <w:rPr>
-          <w:rFonts w:ascii="Times New Roman" w:eastAsia="Times New Roman" w:hAnsi="Times New Roman" w:cs="Times New Roman"/>
-          <w:sz w:val="24"/>
-          <w:szCs w:val="24"/>
-        </w:rPr>
-        <w:t>Alijis</w:t>
-      </w:r>
-      <w:proofErr w:type="spellEnd"/>
-      <w:r>
-        <w:rPr>
-          <w:rFonts w:ascii="Times New Roman" w:eastAsia="Times New Roman" w:hAnsi="Times New Roman" w:cs="Times New Roman"/>
-          <w:sz w:val="24"/>
-          <w:szCs w:val="24"/>
-        </w:rPr>
-        <w:t xml:space="preserve"> Campus, Bacolod City</w:t>
+      <w:r>
+        <w:rPr>
+          <w:rFonts w:ascii="Times New Roman" w:eastAsia="Times New Roman" w:hAnsi="Times New Roman" w:cs="Times New Roman"/>
+          <w:sz w:val="24"/>
+          <w:szCs w:val="24"/>
+        </w:rPr>
+        <w:t>Alijis Campus, Bacolod City</w:t>
       </w:r>
     </w:p>
     <w:p>
@@ -265,16 +237,42 @@
       </w:pPr>
       <w:bookmarkStart w:id="0" w:name="_ypjku42k7hsk" w:colFirst="0" w:colLast="0"/>
       <w:bookmarkEnd w:id="0"/>
-      <w:proofErr w:type="spellStart"/>
-      <w:r>
-        <w:rPr>
-          <w:rFonts w:ascii="Times New Roman" w:eastAsia="Times New Roman" w:hAnsi="Times New Roman" w:cs="Times New Roman"/>
-          <w:sz w:val="24"/>
-          <w:szCs w:val="24"/>
-        </w:rPr>
-        <w:t>Mikhoel</w:t>
-      </w:r>
-      <w:proofErr w:type="spellEnd"/>
+      <w:r>
+        <w:rPr>
+          <w:rFonts w:ascii="Times New Roman" w:eastAsia="Times New Roman" w:hAnsi="Times New Roman" w:cs="Times New Roman"/>
+          <w:sz w:val="24"/>
+          <w:szCs w:val="24"/>
+        </w:rPr>
+        <w:t xml:space="preserve">Mikhoel Runo B. </w:t>
+      </w:r>
+      <w:r>
+        <w:rPr>
+          <w:rFonts w:ascii="Times New Roman" w:eastAsia="Times New Roman" w:hAnsi="Times New Roman" w:cs="Times New Roman"/>
+          <w:color w:val="000000"/>
+          <w:sz w:val="24"/>
+          <w:szCs w:val="24"/>
+        </w:rPr>
+        <w:t xml:space="preserve">Orbigoso  </w:t>
+      </w:r>
+    </w:p>
+    <w:p>
+      <w:pPr>
+        <w:spacing w:after="0" w:line="480" w:lineRule="auto"/>
+        <w:jc w:val="center"/>
+        <w:rPr>
+          <w:rFonts w:ascii="Times New Roman" w:eastAsia="Times New Roman" w:hAnsi="Times New Roman" w:cs="Times New Roman"/>
+          <w:sz w:val="24"/>
+          <w:szCs w:val="24"/>
+        </w:rPr>
+      </w:pPr>
+      <w:r>
+        <w:rPr>
+          <w:rFonts w:ascii="Times New Roman" w:eastAsia="Times New Roman" w:hAnsi="Times New Roman" w:cs="Times New Roman"/>
+          <w:sz w:val="24"/>
+          <w:szCs w:val="24"/>
+        </w:rPr>
+        <w:t>Patrick R.</w:t>
+      </w:r>
       <w:r>
         <w:rPr>
           <w:rFonts w:ascii="Times New Roman" w:eastAsia="Times New Roman" w:hAnsi="Times New Roman" w:cs="Times New Roman"/>
@@ -283,43 +281,13 @@
         </w:rPr>
         <w:t xml:space="preserve"> </w:t>
       </w:r>
-      <w:proofErr w:type="spellStart"/>
-      <w:r>
-        <w:rPr>
-          <w:rFonts w:ascii="Times New Roman" w:eastAsia="Times New Roman" w:hAnsi="Times New Roman" w:cs="Times New Roman"/>
-          <w:sz w:val="24"/>
-          <w:szCs w:val="24"/>
-        </w:rPr>
-        <w:t>Runo</w:t>
-      </w:r>
-      <w:proofErr w:type="spellEnd"/>
-      <w:r>
-        <w:rPr>
-          <w:rFonts w:ascii="Times New Roman" w:eastAsia="Times New Roman" w:hAnsi="Times New Roman" w:cs="Times New Roman"/>
-          <w:sz w:val="24"/>
-          <w:szCs w:val="24"/>
-        </w:rPr>
-        <w:t xml:space="preserve"> B. </w:t>
-      </w:r>
-      <w:proofErr w:type="spellStart"/>
-      <w:r>
-        <w:rPr>
-          <w:rFonts w:ascii="Times New Roman" w:eastAsia="Times New Roman" w:hAnsi="Times New Roman" w:cs="Times New Roman"/>
-          <w:color w:val="000000"/>
-          <w:sz w:val="24"/>
-          <w:szCs w:val="24"/>
-        </w:rPr>
-        <w:t>Orbigoso</w:t>
-      </w:r>
-      <w:proofErr w:type="spellEnd"/>
-      <w:r>
-        <w:rPr>
-          <w:rFonts w:ascii="Times New Roman" w:eastAsia="Times New Roman" w:hAnsi="Times New Roman" w:cs="Times New Roman"/>
-          <w:color w:val="000000"/>
-          <w:sz w:val="24"/>
-          <w:szCs w:val="24"/>
-        </w:rPr>
-        <w:t xml:space="preserve">  </w:t>
+      <w:r>
+        <w:rPr>
+          <w:rFonts w:ascii="Times New Roman" w:eastAsia="Times New Roman" w:hAnsi="Times New Roman" w:cs="Times New Roman"/>
+          <w:sz w:val="24"/>
+          <w:szCs w:val="24"/>
+        </w:rPr>
+        <w:t>Sagum</w:t>
       </w:r>
     </w:p>
     <w:p>
@@ -338,56 +306,8 @@
           <w:sz w:val="24"/>
           <w:szCs w:val="24"/>
         </w:rPr>
-        <w:t>Patrick R.</w:t>
-      </w:r>
-      <w:r>
-        <w:rPr>
-          <w:rFonts w:ascii="Times New Roman" w:eastAsia="Times New Roman" w:hAnsi="Times New Roman" w:cs="Times New Roman"/>
-          <w:sz w:val="24"/>
-          <w:szCs w:val="24"/>
-        </w:rPr>
-        <w:t xml:space="preserve"> </w:t>
-      </w:r>
-      <w:proofErr w:type="spellStart"/>
-      <w:r>
-        <w:rPr>
-          <w:rFonts w:ascii="Times New Roman" w:eastAsia="Times New Roman" w:hAnsi="Times New Roman" w:cs="Times New Roman"/>
-          <w:sz w:val="24"/>
-          <w:szCs w:val="24"/>
-        </w:rPr>
-        <w:t>Sagum</w:t>
-      </w:r>
-      <w:proofErr w:type="spellEnd"/>
-    </w:p>
-    <w:p>
-      <w:pPr>
-        <w:spacing w:after="0" w:line="480" w:lineRule="auto"/>
-        <w:jc w:val="center"/>
-        <w:rPr>
-          <w:rFonts w:ascii="Times New Roman" w:eastAsia="Times New Roman" w:hAnsi="Times New Roman" w:cs="Times New Roman"/>
-          <w:sz w:val="24"/>
-          <w:szCs w:val="24"/>
-        </w:rPr>
-      </w:pPr>
-      <w:proofErr w:type="spellStart"/>
-      <w:r>
-        <w:rPr>
-          <w:rFonts w:ascii="Times New Roman" w:eastAsia="Times New Roman" w:hAnsi="Times New Roman" w:cs="Times New Roman"/>
-          <w:sz w:val="24"/>
-          <w:szCs w:val="24"/>
-        </w:rPr>
-        <w:t>Maika</w:t>
-      </w:r>
-      <w:proofErr w:type="spellEnd"/>
-      <w:r>
-        <w:rPr>
-          <w:rFonts w:ascii="Times New Roman" w:eastAsia="Times New Roman" w:hAnsi="Times New Roman" w:cs="Times New Roman"/>
-          <w:sz w:val="24"/>
-          <w:szCs w:val="24"/>
-        </w:rPr>
-        <w:t xml:space="preserve"> T. </w:t>
-      </w:r>
-      <w:proofErr w:type="spellStart"/>
+        <w:t xml:space="preserve">Maika T. </w:t>
+      </w:r>
       <w:r>
         <w:rPr>
           <w:rFonts w:ascii="Times New Roman" w:eastAsia="Times New Roman" w:hAnsi="Times New Roman" w:cs="Times New Roman"/>
@@ -396,7 +316,6 @@
         </w:rPr>
         <w:t>Zambra</w:t>
       </w:r>
-      <w:proofErr w:type="spellEnd"/>
     </w:p>
     <w:p>
       <w:pPr>
@@ -1176,25 +1095,7 @@
           <w:sz w:val="24"/>
           <w:szCs w:val="24"/>
         </w:rPr>
-        <w:t xml:space="preserve"> The research offers empirical evidence concerning the use of the AI-based web-based learning systems in the Philippine public </w:t>
-      </w:r>
-      <w:proofErr w:type="gramStart"/>
-      <w:r>
-        <w:rPr>
-          <w:rFonts w:ascii="Times New Roman" w:eastAsia="Times New Roman" w:hAnsi="Times New Roman" w:cs="Times New Roman"/>
-          <w:sz w:val="24"/>
-          <w:szCs w:val="24"/>
-        </w:rPr>
-        <w:t>schools</w:t>
-      </w:r>
-      <w:proofErr w:type="gramEnd"/>
-      <w:r>
-        <w:rPr>
-          <w:rFonts w:ascii="Times New Roman" w:eastAsia="Times New Roman" w:hAnsi="Times New Roman" w:cs="Times New Roman"/>
-          <w:sz w:val="24"/>
-          <w:szCs w:val="24"/>
-        </w:rPr>
-        <w:t xml:space="preserve"> environment. The effectiveness of the system to enhance the learning results, improve the process of assessments, and assist personalized learning can be studied by the researchers as the part of the overall literature on educational technology and AI-assisted learning.</w:t>
+        <w:t xml:space="preserve"> The research offers empirical evidence concerning the use of the AI-based web-based learning systems in the Philippine public schools environment. The effectiveness of the system to enhance the learning results, improve the process of assessments, and assist personalized learning can be studied by the researchers as the part of the overall literature on educational technology and AI-assisted learning.</w:t>
       </w:r>
     </w:p>
     <w:p>
@@ -1403,27 +1304,7 @@
           <w:sz w:val="24"/>
           <w:szCs w:val="24"/>
         </w:rPr>
-        <w:t xml:space="preserve"> Contextually, this refers to the use of neural question generation techniques and natural language processing to automatically create educationally valuable assessment items from learning materials, ensuring both fluency and pedagogical relevance (</w:t>
-      </w:r>
-      <w:proofErr w:type="spellStart"/>
-      <w:r>
-        <w:rPr>
-          <w:rFonts w:ascii="Times New Roman" w:eastAsia="Times New Roman" w:hAnsi="Times New Roman" w:cs="Times New Roman"/>
-          <w:color w:val="000000"/>
-          <w:sz w:val="24"/>
-          <w:szCs w:val="24"/>
-        </w:rPr>
-        <w:t>Bulathwela</w:t>
-      </w:r>
-      <w:proofErr w:type="spellEnd"/>
-      <w:r>
-        <w:rPr>
-          <w:rFonts w:ascii="Times New Roman" w:eastAsia="Times New Roman" w:hAnsi="Times New Roman" w:cs="Times New Roman"/>
-          <w:color w:val="000000"/>
-          <w:sz w:val="24"/>
-          <w:szCs w:val="24"/>
-        </w:rPr>
-        <w:t xml:space="preserve"> et al., 2023).</w:t>
+        <w:t xml:space="preserve"> Contextually, this refers to the use of neural question generation techniques and natural language processing to automatically create educationally valuable assessment items from learning materials, ensuring both fluency and pedagogical relevance (Bulathwela et al., 2023).</w:t>
       </w:r>
     </w:p>
     <w:p>
@@ -1492,27 +1373,7 @@
           <w:sz w:val="24"/>
           <w:szCs w:val="24"/>
         </w:rPr>
-        <w:t xml:space="preserve"> Contextually, it refers to the use of algorithms and natural language processing to evaluate student responses and assign scores based on predefined assessment criteria, reducing manual grading workload while maintaining consistency (Ramesh &amp; </w:t>
-      </w:r>
-      <w:proofErr w:type="spellStart"/>
-      <w:r>
-        <w:rPr>
-          <w:rFonts w:ascii="Times New Roman" w:eastAsia="Times New Roman" w:hAnsi="Times New Roman" w:cs="Times New Roman"/>
-          <w:color w:val="000000"/>
-          <w:sz w:val="24"/>
-          <w:szCs w:val="24"/>
-        </w:rPr>
-        <w:t>Sanampudi</w:t>
-      </w:r>
-      <w:proofErr w:type="spellEnd"/>
-      <w:r>
-        <w:rPr>
-          <w:rFonts w:ascii="Times New Roman" w:eastAsia="Times New Roman" w:hAnsi="Times New Roman" w:cs="Times New Roman"/>
-          <w:color w:val="000000"/>
-          <w:sz w:val="24"/>
-          <w:szCs w:val="24"/>
-        </w:rPr>
-        <w:t>, 2022).</w:t>
+        <w:t xml:space="preserve"> Contextually, it refers to the use of algorithms and natural language processing to evaluate student responses and assign scores based on predefined assessment criteria, reducing manual grading workload while maintaining consistency (Ramesh &amp; Sanampudi, 2022).</w:t>
       </w:r>
     </w:p>
     <w:p>
@@ -1540,25 +1401,7 @@
           <w:sz w:val="24"/>
           <w:szCs w:val="24"/>
         </w:rPr>
-        <w:t xml:space="preserve">Operationally, it is the system component in A.I.M.S. that administers quizzes, records responses securely, and automatically </w:t>
-      </w:r>
-      <w:proofErr w:type="gramStart"/>
-      <w:r>
-        <w:rPr>
-          <w:rFonts w:ascii="Times New Roman" w:hAnsi="Times New Roman" w:cs="Times New Roman"/>
-          <w:sz w:val="24"/>
-          <w:szCs w:val="24"/>
-        </w:rPr>
-        <w:t>computes</w:t>
-      </w:r>
-      <w:proofErr w:type="gramEnd"/>
-      <w:r>
-        <w:rPr>
-          <w:rFonts w:ascii="Times New Roman" w:hAnsi="Times New Roman" w:cs="Times New Roman"/>
-          <w:sz w:val="24"/>
-          <w:szCs w:val="24"/>
-        </w:rPr>
-        <w:t xml:space="preserve"> preliminary scores for objective items. For responses requiring human judgment, it supports teacher validation using customizable rubrics before final scores are logged and made visible to students as feedback.</w:t>
+        <w:t>Operationally, it is the system component in A.I.M.S. that administers quizzes, records responses securely, and automatically computes preliminary scores for objective items. For responses requiring human judgment, it supports teacher validation using customizable rubrics before final scores are logged and made visible to students as feedback.</w:t>
       </w:r>
     </w:p>
     <w:p>
@@ -1591,14 +1434,6 @@
         </w:rPr>
         <w:t>Centralized Learning Portal. Contextually, this is an integrated online platform within a learning management system that supports structured content delivery and access to learning resources, as well as course activities and assessments (Dahal &amp; Manandhar, 2024).</w:t>
       </w:r>
-      <w:r>
-        <w:rPr>
-          <w:rFonts w:ascii="Times New Roman" w:eastAsia="Times New Roman" w:hAnsi="Times New Roman" w:cs="Times New Roman"/>
-          <w:color w:val="000000"/>
-          <w:sz w:val="24"/>
-          <w:szCs w:val="24"/>
-        </w:rPr>
-      </w:r>
     </w:p>
     <w:p>
       <w:pPr>
@@ -1656,6 +1491,7 @@
           <w:sz w:val="24"/>
           <w:szCs w:val="24"/>
         </w:rPr>
+        <w:lastRenderedPageBreak/>
         <w:t>Mastery-Based Learning Module.</w:t>
       </w:r>
       <w:r>
@@ -1665,37 +1501,7 @@
           <w:sz w:val="24"/>
           <w:szCs w:val="24"/>
         </w:rPr>
-        <w:t xml:space="preserve"> Contextually, in competency-based education, this is a progression mechanism where students acquire knowledge and complete formative </w:t>
-      </w:r>
-      <w:r>
-        <w:rPr>
-          <w:rFonts w:ascii="Times New Roman" w:eastAsia="Times New Roman" w:hAnsi="Times New Roman" w:cs="Times New Roman"/>
-          <w:color w:val="000000"/>
-          <w:sz w:val="24"/>
-          <w:szCs w:val="24"/>
-        </w:rPr>
-        <w:lastRenderedPageBreak/>
-        <w:t>assessments, proceeding to new content only after demonstrating mastery of prerequisite material through corrective pathways and retesting (</w:t>
-      </w:r>
-      <w:proofErr w:type="spellStart"/>
-      <w:r>
-        <w:rPr>
-          <w:rFonts w:ascii="Times New Roman" w:eastAsia="Times New Roman" w:hAnsi="Times New Roman" w:cs="Times New Roman"/>
-          <w:color w:val="000000"/>
-          <w:sz w:val="24"/>
-          <w:szCs w:val="24"/>
-        </w:rPr>
-        <w:t>Persky</w:t>
-      </w:r>
-      <w:proofErr w:type="spellEnd"/>
-      <w:r>
-        <w:rPr>
-          <w:rFonts w:ascii="Times New Roman" w:eastAsia="Times New Roman" w:hAnsi="Times New Roman" w:cs="Times New Roman"/>
-          <w:color w:val="000000"/>
-          <w:sz w:val="24"/>
-          <w:szCs w:val="24"/>
-        </w:rPr>
-        <w:t xml:space="preserve"> &amp; Hughes, 2022).</w:t>
+        <w:t xml:space="preserve"> Contextually, in competency-based education, this is a progression mechanism where students acquire knowledge and complete formative assessments, proceeding to new content only after demonstrating mastery of prerequisite material through corrective pathways and retesting (Persky &amp; Hughes, 2022).</w:t>
       </w:r>
     </w:p>
     <w:p>
@@ -1764,29 +1570,7 @@
           <w:sz w:val="24"/>
           <w:szCs w:val="24"/>
         </w:rPr>
-        <w:t>Contextually, this refers to an adaptive remediation mechanism that delivers targeted corrective assessment activities aligned with identified learning gaps to support mastery learning and timely intervention (</w:t>
-      </w:r>
-      <w:proofErr w:type="spellStart"/>
-      <w:r>
-        <w:rPr>
-          <w:rFonts w:ascii="Times New Roman" w:eastAsia="Times New Roman" w:hAnsi="Times New Roman" w:cs="Times New Roman"/>
-          <w:bCs/>
-          <w:color w:val="000000"/>
-          <w:sz w:val="24"/>
-          <w:szCs w:val="24"/>
-        </w:rPr>
-        <w:t>Persky</w:t>
-      </w:r>
-      <w:proofErr w:type="spellEnd"/>
-      <w:r>
-        <w:rPr>
-          <w:rFonts w:ascii="Times New Roman" w:eastAsia="Times New Roman" w:hAnsi="Times New Roman" w:cs="Times New Roman"/>
-          <w:bCs/>
-          <w:color w:val="000000"/>
-          <w:sz w:val="24"/>
-          <w:szCs w:val="24"/>
-        </w:rPr>
-        <w:t xml:space="preserve"> &amp; Hughes, 2022).</w:t>
+        <w:t>Contextually, this refers to an adaptive remediation mechanism that delivers targeted corrective assessment activities aligned with identified learning gaps to support mastery learning and timely intervention (Persky &amp; Hughes, 2022).</w:t>
       </w:r>
     </w:p>
     <w:p>
@@ -2241,25 +2025,7 @@
           <w:sz w:val="24"/>
           <w:szCs w:val="24"/>
         </w:rPr>
-        <w:t xml:space="preserve">In the Philippine context, the challenge of uneven access to learning materials and inadequate infrastructure has long impeded effective teaching in public schools. Bustillo and </w:t>
-      </w:r>
-      <w:proofErr w:type="spellStart"/>
-      <w:r>
-        <w:rPr>
-          <w:rFonts w:ascii="Times New Roman" w:hAnsi="Times New Roman" w:cs="Times New Roman"/>
-          <w:sz w:val="24"/>
-          <w:szCs w:val="24"/>
-        </w:rPr>
-        <w:t>Aguilos</w:t>
-      </w:r>
-      <w:proofErr w:type="spellEnd"/>
-      <w:r>
-        <w:rPr>
-          <w:rFonts w:ascii="Times New Roman" w:hAnsi="Times New Roman" w:cs="Times New Roman"/>
-          <w:sz w:val="24"/>
-          <w:szCs w:val="24"/>
-        </w:rPr>
-        <w:t xml:space="preserve"> (2022) documented persistent barriers to educational technology adoption, </w:t>
+        <w:t xml:space="preserve">In the Philippine context, the challenge of uneven access to learning materials and inadequate infrastructure has long impeded effective teaching in public schools. Bustillo and Aguilos (2022) documented persistent barriers to educational technology adoption, noting that teachers are often compelled to distribute printed modules manually—an </w:t>
       </w:r>
       <w:r>
         <w:rPr>
@@ -2268,7 +2034,7 @@
           <w:szCs w:val="24"/>
         </w:rPr>
         <w:lastRenderedPageBreak/>
-        <w:t>noting that teachers are often compelled to distribute printed modules manually—an approach that is both inefficient and prone to inconsistencies due to limited reproduction resources and geographical accessibility constraints. Their study highlights that digital platforms capable of centralizing and streamlining module distribution offer a practical and scalable solution to the longstanding inequities in educational resource access across Philippine public schools, making a compelling case for LMS-integrated digital libraries as an institutional priority.</w:t>
+        <w:t>approach that is both inefficient and prone to inconsistencies due to limited reproduction resources and geographical accessibility constraints. Their study highlights that digital platforms capable of centralizing and streamlining module distribution offer a practical and scalable solution to the longstanding inequities in educational resource access across Philippine public schools, making a compelling case for LMS-integrated digital libraries as an institutional priority.</w:t>
       </w:r>
     </w:p>
     <w:p>
@@ -2290,22 +2056,6 @@
         </w:rPr>
         <w:t>Web-based module management systems address access and distribution constraints by enabling instructors to upload, categorize, and update learning materials electronically, while students retrieve resources through a standardized platform. Dahal and Manandhar (2024) highlighted that resources and learning management and content management are key success factors for LMS implementation, while also identifying assessment and learning engagement as areas that can fail when platforms are used only as passive storage. Accordingly, the centralized learning portal in A.I.M.S. should be designed not only for material distribution but also to support task submission and teacher-managed assessment workflows in a manner that remains practical for real-world classroom implementation.</w:t>
       </w:r>
-      <w:proofErr w:type="spellStart"/>
-      <w:r>
-        <w:rPr>
-          <w:rFonts w:ascii="Times New Roman" w:hAnsi="Times New Roman" w:cs="Times New Roman"/>
-          <w:sz w:val="24"/>
-          <w:szCs w:val="24"/>
-        </w:rPr>
-      </w:r>
-      <w:proofErr w:type="spellEnd"/>
-      <w:r>
-        <w:rPr>
-          <w:rFonts w:ascii="Times New Roman" w:hAnsi="Times New Roman" w:cs="Times New Roman"/>
-          <w:sz w:val="24"/>
-          <w:szCs w:val="24"/>
-        </w:rPr>
-      </w:r>
     </w:p>
     <w:p>
       <w:pPr>
@@ -2356,25 +2106,7 @@
           <w:sz w:val="24"/>
           <w:szCs w:val="24"/>
         </w:rPr>
-        <w:t xml:space="preserve">Artificial intelligence has fundamentally transformed how educational assessments are designed and administered, particularly through automated question generation. </w:t>
-      </w:r>
-      <w:proofErr w:type="spellStart"/>
-      <w:r>
-        <w:rPr>
-          <w:rFonts w:ascii="Times New Roman" w:hAnsi="Times New Roman" w:cs="Times New Roman"/>
-          <w:sz w:val="24"/>
-          <w:szCs w:val="24"/>
-        </w:rPr>
-        <w:t>Bulathwela</w:t>
-      </w:r>
-      <w:proofErr w:type="spellEnd"/>
-      <w:r>
-        <w:rPr>
-          <w:rFonts w:ascii="Times New Roman" w:hAnsi="Times New Roman" w:cs="Times New Roman"/>
-          <w:sz w:val="24"/>
-          <w:szCs w:val="24"/>
-        </w:rPr>
-        <w:t xml:space="preserve"> et al. (2023) conducted an extensive review of neural question generation </w:t>
+        <w:t xml:space="preserve">Artificial intelligence has fundamentally transformed how educational assessments are designed and administered, particularly through automated question generation. Bulathwela et al. (2023) conducted an extensive review of neural question generation </w:t>
       </w:r>
       <w:r>
         <w:rPr>
@@ -2403,25 +2135,7 @@
           <w:sz w:val="24"/>
           <w:szCs w:val="24"/>
         </w:rPr>
-        <w:t xml:space="preserve">Recent research has further validated the use of large language models (LLMs) in automated question generation for educational domains. </w:t>
-      </w:r>
-      <w:proofErr w:type="spellStart"/>
-      <w:r>
-        <w:rPr>
-          <w:rFonts w:ascii="Times New Roman" w:hAnsi="Times New Roman" w:cs="Times New Roman"/>
-          <w:sz w:val="24"/>
-          <w:szCs w:val="24"/>
-        </w:rPr>
-        <w:t>Alamoudi</w:t>
-      </w:r>
-      <w:proofErr w:type="spellEnd"/>
-      <w:r>
-        <w:rPr>
-          <w:rFonts w:ascii="Times New Roman" w:hAnsi="Times New Roman" w:cs="Times New Roman"/>
-          <w:sz w:val="24"/>
-          <w:szCs w:val="24"/>
-        </w:rPr>
-        <w:t xml:space="preserve"> et al. (2025) compared three methodological approaches—template-based structured ontology generation, LLM-based structured ontology generation, and LLM-based flat concept list generation—using BERT Precision, Recall, F1-score, and semantic similarity as performance metrics. Their findings indicate that the LLM-based flat concept list approach achieved the highest semantic similarity (0.567) and the most balanced precision-recall performance. Significantly, the authors noted that unstructured LLM generation occasionally produced hallucinated or topically unrelated questions, reinforcing the necessity of instructor validation controls in any AI-powered quiz generation system to ensure accuracy, curriculum alignment, and pedagogical relevance before deployment.</w:t>
+        <w:t>Recent research has further validated the use of large language models (LLMs) in automated question generation for educational domains. Alamoudi et al. (2025) compared three methodological approaches—template-based structured ontology generation, LLM-based structured ontology generation, and LLM-based flat concept list generation—using BERT Precision, Recall, F1-score, and semantic similarity as performance metrics. Their findings indicate that the LLM-based flat concept list approach achieved the highest semantic similarity (0.567) and the most balanced precision-recall performance. Significantly, the authors noted that unstructured LLM generation occasionally produced hallucinated or topically unrelated questions, reinforcing the necessity of instructor validation controls in any AI-powered quiz generation system to ensure accuracy, curriculum alignment, and pedagogical relevance before deployment.</w:t>
       </w:r>
     </w:p>
     <w:p>
@@ -2441,46 +2155,16 @@
           <w:sz w:val="24"/>
           <w:szCs w:val="24"/>
         </w:rPr>
-        <w:t>In the Philippine educational landscape, the integration of learning management systems in public schools is often constrained by contextual and operational barriers. Balase and Paglinawan (2025) reported that teachers recognized the DepEd Learning Management System as beneficial for digital instruction and engagement, but also emphasized persistent barriers such as unstable connectivity, limited technical support, digital literacy gaps, and workload management concerns. These constraints underscore the importance of designing A.I.M.S. features to streamline teacher workflows and reduce additional administrative overhead, while maintaining instructor validation controls to preserve pedagogical integrity.</w:t>
-      </w:r>
-      <w:proofErr w:type="spellStart"/>
-      <w:r>
-        <w:rPr>
-          <w:rFonts w:ascii="Times New Roman" w:hAnsi="Times New Roman" w:cs="Times New Roman"/>
-          <w:sz w:val="24"/>
-          <w:szCs w:val="24"/>
-        </w:rPr>
-      </w:r>
-      <w:proofErr w:type="spellEnd"/>
-      <w:r>
-        <w:rPr>
-          <w:rFonts w:ascii="Times New Roman" w:hAnsi="Times New Roman" w:cs="Times New Roman"/>
-          <w:sz w:val="24"/>
-          <w:szCs w:val="24"/>
-        </w:rPr>
-      </w:r>
-      <w:proofErr w:type="spellStart"/>
-      <w:r>
-        <w:rPr>
-          <w:rFonts w:ascii="Times New Roman" w:hAnsi="Times New Roman" w:cs="Times New Roman"/>
-          <w:sz w:val="24"/>
-          <w:szCs w:val="24"/>
-        </w:rPr>
-      </w:r>
-      <w:proofErr w:type="spellEnd"/>
-      <w:r>
-        <w:rPr>
-          <w:rFonts w:ascii="Times New Roman" w:hAnsi="Times New Roman" w:cs="Times New Roman"/>
-          <w:sz w:val="24"/>
-          <w:szCs w:val="24"/>
-        </w:rPr>
-      </w:r>
-      <w:r>
-        <w:rPr>
-          <w:rFonts w:ascii="Times New Roman" w:hAnsi="Times New Roman" w:cs="Times New Roman"/>
-          <w:sz w:val="24"/>
-          <w:szCs w:val="24"/>
-        </w:rPr>
+        <w:t xml:space="preserve">In the Philippine educational landscape, the integration of learning management systems in public schools is often constrained by contextual and operational barriers. Balase and Paglinawan (2025) reported that teachers recognized the DepEd Learning </w:t>
+      </w:r>
+      <w:r>
+        <w:rPr>
+          <w:rFonts w:ascii="Times New Roman" w:hAnsi="Times New Roman" w:cs="Times New Roman"/>
+          <w:sz w:val="24"/>
+          <w:szCs w:val="24"/>
+        </w:rPr>
+        <w:lastRenderedPageBreak/>
+        <w:t>Management System as beneficial for digital instruction and engagement, but also emphasized persistent barriers such as unstable connectivity, limited technical support, digital literacy gaps, and workload management concerns. These constraints underscore the importance of designing A.I.M.S. features to streamline teacher workflows and reduce additional administrative overhead, while maintaining instructor validation controls to preserve pedagogical integrity.</w:t>
       </w:r>
     </w:p>
     <w:p>
@@ -2516,22 +2200,6 @@
         </w:rPr>
         <w:t>Automated grading systems have gained considerable traction in educational technology research as a response to the time demands and consistency limitations of manual evaluation. Ramesh and Sanampudi (2022) presented a systematic literature review of automated essay scoring (AES) systems, synthesizing research on machine learning and natural language processing approaches for grading written responses and outlining key challenges for reliable deployment in educational contexts. This body of work supports the inclusion of an automated assessment and grading engine in A.I.M.S., particularly when paired with teacher validation mechanisms and rubric-guided scoring to align automated outputs with instructor expectations.</w:t>
       </w:r>
-      <w:proofErr w:type="spellStart"/>
-      <w:r>
-        <w:rPr>
-          <w:rFonts w:ascii="Times New Roman" w:hAnsi="Times New Roman" w:cs="Times New Roman"/>
-          <w:sz w:val="24"/>
-          <w:szCs w:val="24"/>
-        </w:rPr>
-      </w:r>
-      <w:proofErr w:type="spellEnd"/>
-      <w:r>
-        <w:rPr>
-          <w:rFonts w:ascii="Times New Roman" w:hAnsi="Times New Roman" w:cs="Times New Roman"/>
-          <w:sz w:val="24"/>
-          <w:szCs w:val="24"/>
-        </w:rPr>
-      </w:r>
     </w:p>
     <w:p>
       <w:pPr>
@@ -2545,7 +2213,7 @@
           <w:sz w:val="24"/>
           <w:szCs w:val="24"/>
         </w:rPr>
-        <w:t xml:space="preserve">Beyond holistic scoring, the incorporation of customizable rubrics into automated grading systems is critical for aligning AI-generated scores with instructor-defined </w:t>
+        <w:t xml:space="preserve">Beyond holistic scoring, the incorporation of customizable rubrics into automated grading systems is critical for aligning AI-generated scores with instructor-defined pedagogical standards. García-Varela et al. (2025) investigated the reliability and fairness of ChatGPT as an automated essay scoring tool, demonstrating that when provided with explicit, normalized rubrics and standardized output formats at low temperature settings, </w:t>
       </w:r>
       <w:r>
         <w:rPr>
@@ -2554,43 +2222,7 @@
           <w:szCs w:val="24"/>
         </w:rPr>
         <w:lastRenderedPageBreak/>
-        <w:t xml:space="preserve">pedagogical standards. </w:t>
-      </w:r>
-      <w:proofErr w:type="spellStart"/>
-      <w:r>
-        <w:rPr>
-          <w:rFonts w:ascii="Times New Roman" w:hAnsi="Times New Roman" w:cs="Times New Roman"/>
-          <w:sz w:val="24"/>
-          <w:szCs w:val="24"/>
-        </w:rPr>
-        <w:t>García</w:t>
-      </w:r>
-      <w:proofErr w:type="spellEnd"/>
-      <w:r>
-        <w:rPr>
-          <w:rFonts w:ascii="Times New Roman" w:hAnsi="Times New Roman" w:cs="Times New Roman"/>
-          <w:sz w:val="24"/>
-          <w:szCs w:val="24"/>
-        </w:rPr>
-        <w:t xml:space="preserve">-Varela et al. (2025) investigated the reliability and fairness of </w:t>
-      </w:r>
-      <w:proofErr w:type="spellStart"/>
-      <w:r>
-        <w:rPr>
-          <w:rFonts w:ascii="Times New Roman" w:hAnsi="Times New Roman" w:cs="Times New Roman"/>
-          <w:sz w:val="24"/>
-          <w:szCs w:val="24"/>
-        </w:rPr>
-        <w:t>ChatGPT</w:t>
-      </w:r>
-      <w:proofErr w:type="spellEnd"/>
-      <w:r>
-        <w:rPr>
-          <w:rFonts w:ascii="Times New Roman" w:hAnsi="Times New Roman" w:cs="Times New Roman"/>
-          <w:sz w:val="24"/>
-          <w:szCs w:val="24"/>
-        </w:rPr>
-        <w:t xml:space="preserve"> as an automated essay scoring tool, demonstrating that when provided with explicit, normalized rubrics and standardized output formats at low temperature settings, the model achieved perfect grading consistency across ten independent evaluation sessions. Their study also developed a scalable algorithm that automatically generates normalized grading rubrics and decision tables from any open-ended question with minimal instructor input. These findings confirm that the combination of AI grading capability with customizable rubric structures yields consistent, transparent, and educationally sound assessment outcomes.</w:t>
+        <w:t>the model achieved perfect grading consistency across ten independent evaluation sessions. Their study also developed a scalable algorithm that automatically generates normalized grading rubrics and decision tables from any open-ended question with minimal instructor input. These findings confirm that the combination of AI grading capability with customizable rubric structures yields consistent, transparent, and educationally sound assessment outcomes.</w:t>
       </w:r>
     </w:p>
     <w:p>
@@ -2606,45 +2238,6 @@
           <w:szCs w:val="24"/>
         </w:rPr>
         <w:t>In Philippine educational settings, persistent infrastructural and capacity constraints continue to shape how digital tools are adopted and sustained. Colegado (2025), in a scoping review of digital innovations across Philippine K-12 science education, reported that teachers relied heavily on accessible platforms and that learning management systems such as Google Classroom and Quipper were used to provide structure for content delivery and assessment. However, the review emphasized ongoing challenges including poor connectivity, unequal device access, and limited teacher preparation, particularly in rural and underserved contexts. These findings highlight the need for A.I.M.S. to support structured assessment workflows and teacher-defined scoring criteria within realistic implementation constraints in Philippine public schools.</w:t>
-      </w:r>
-      <w:proofErr w:type="spellStart"/>
-      <w:r>
-        <w:rPr>
-          <w:rFonts w:ascii="Times New Roman" w:hAnsi="Times New Roman" w:cs="Times New Roman"/>
-          <w:sz w:val="24"/>
-          <w:szCs w:val="24"/>
-        </w:rPr>
-      </w:r>
-      <w:proofErr w:type="spellEnd"/>
-      <w:r>
-        <w:rPr>
-          <w:rFonts w:ascii="Times New Roman" w:hAnsi="Times New Roman" w:cs="Times New Roman"/>
-          <w:sz w:val="24"/>
-          <w:szCs w:val="24"/>
-        </w:rPr>
-      </w:r>
-      <w:proofErr w:type="spellStart"/>
-      <w:r>
-        <w:rPr>
-          <w:rFonts w:ascii="Times New Roman" w:hAnsi="Times New Roman" w:cs="Times New Roman"/>
-          <w:sz w:val="24"/>
-          <w:szCs w:val="24"/>
-        </w:rPr>
-      </w:r>
-      <w:proofErr w:type="spellEnd"/>
-      <w:r>
-        <w:rPr>
-          <w:rFonts w:ascii="Times New Roman" w:hAnsi="Times New Roman" w:cs="Times New Roman"/>
-          <w:sz w:val="24"/>
-          <w:szCs w:val="24"/>
-        </w:rPr>
-      </w:r>
-      <w:r>
-        <w:rPr>
-          <w:rFonts w:ascii="Times New Roman" w:hAnsi="Times New Roman" w:cs="Times New Roman"/>
-          <w:sz w:val="24"/>
-          <w:szCs w:val="24"/>
-        </w:rPr>
       </w:r>
     </w:p>
     <w:p>
@@ -2688,7 +2281,16 @@
           <w:sz w:val="24"/>
           <w:szCs w:val="24"/>
         </w:rPr>
-        <w:t>Dynamic remediation is a core element of mastery-oriented instruction, which requires systematic corrective feedback mechanisms and structured opportunities for retesting when learners do not meet performance thresholds (Persky &amp; Hughes, 2022). In the context of A.I.M.S., the proposed dynamic remedial quiz generator applies this principle by using identified learning gaps to support the drafting of targeted remedial assessment items for teacher-reviewed intervention and re-assessment. Local evidence further affirms that structured remediation interventions can yield measurable learning gains in Philippine public school contexts (Jumao-as et al., 2025).</w:t>
+        <w:t xml:space="preserve">Dynamic remediation is a core element of mastery-oriented instruction, which requires systematic corrective feedback mechanisms and structured opportunities for retesting when learners do not meet performance thresholds (Persky &amp; Hughes, 2022). In the context of A.I.M.S., the proposed dynamic remedial quiz generator applies this </w:t>
+      </w:r>
+      <w:r>
+        <w:rPr>
+          <w:rFonts w:ascii="Times New Roman" w:hAnsi="Times New Roman" w:cs="Times New Roman"/>
+          <w:sz w:val="24"/>
+          <w:szCs w:val="24"/>
+        </w:rPr>
+        <w:lastRenderedPageBreak/>
+        <w:t>principle by using identified learning gaps to support the drafting of targeted remedial assessment items for teacher-reviewed intervention and re-assessment. Local evidence further affirms that structured remediation interventions can yield measurable learning gains in Philippine public school contexts (Jumao-as et al., 2025).</w:t>
       </w:r>
     </w:p>
     <w:p>
@@ -2743,29 +2345,6 @@
         </w:rPr>
         <w:t>Mastery-based learning is a pedagogical model grounded in the principle that all students can achieve academic proficiency when given sufficient time, appropriate instructional support, and the opportunity to demonstrate competency before progressing to subsequent content. Persky and Hughes (2022) conducted a comprehensive review of mastery learning principles and their practical application in varied educational contexts, finding that mastery-based instruction consistently outperformed traditional time-based delivery models in promoting long-term content retention, reducing achievement gaps, and improving student confidence. Their review emphasized that effective mastery learning frameworks require clearly defined performance thresholds, systematic corrective feedback mechanisms, and structured opportunities for retesting. These principles provide the pedagogical basis for the proposed mastery-based learning module in A.I.M.S., where progression controls are used as a system design mechanism to enforce competency-based sequencing.</w:t>
       </w:r>
-      <w:proofErr w:type="spellStart"/>
-      <w:r>
-        <w:rPr>
-          <w:rFonts w:ascii="Times New Roman" w:hAnsi="Times New Roman" w:cs="Times New Roman"/>
-          <w:sz w:val="24"/>
-          <w:szCs w:val="24"/>
-        </w:rPr>
-      </w:r>
-      <w:proofErr w:type="spellEnd"/>
-      <w:r>
-        <w:rPr>
-          <w:rFonts w:ascii="Times New Roman" w:hAnsi="Times New Roman" w:cs="Times New Roman"/>
-          <w:sz w:val="24"/>
-          <w:szCs w:val="24"/>
-        </w:rPr>
-      </w:r>
-      <w:r>
-        <w:rPr>
-          <w:rFonts w:ascii="Times New Roman" w:hAnsi="Times New Roman" w:cs="Times New Roman"/>
-          <w:sz w:val="24"/>
-          <w:szCs w:val="24"/>
-        </w:rPr>
-      </w:r>
     </w:p>
     <w:p>
       <w:pPr>
@@ -2784,71 +2363,16 @@
           <w:sz w:val="24"/>
           <w:szCs w:val="24"/>
         </w:rPr>
-        <w:t>In the Philippine educational context, the sustained implementation of digital learning platforms is influenced by practical constraints that limit teachers' capacity to manage additional system processes. Balase and Paglinawan (2025) highlighted barriers to effective LMS integration in public schools, including unstable connectivity, limited technical support, digital literacy gaps, and workload management concerns. Accordingly, the mastery-based learning module in A.I.M.S. should be designed to support competency-based progression in a way that minimizes added teacher workload while maintaining clear performance thresholds and instructor oversight.</w:t>
-      </w:r>
-      <w:proofErr w:type="spellStart"/>
-      <w:r>
-        <w:rPr>
-          <w:rFonts w:ascii="Times New Roman" w:hAnsi="Times New Roman" w:cs="Times New Roman"/>
-          <w:sz w:val="24"/>
-          <w:szCs w:val="24"/>
-        </w:rPr>
-      </w:r>
-      <w:proofErr w:type="spellEnd"/>
-      <w:r>
-        <w:rPr>
-          <w:rFonts w:ascii="Times New Roman" w:hAnsi="Times New Roman" w:cs="Times New Roman"/>
-          <w:sz w:val="24"/>
-          <w:szCs w:val="24"/>
-        </w:rPr>
-      </w:r>
-      <w:proofErr w:type="spellStart"/>
-      <w:r>
-        <w:rPr>
-          <w:rFonts w:ascii="Times New Roman" w:hAnsi="Times New Roman" w:cs="Times New Roman"/>
-          <w:sz w:val="24"/>
-          <w:szCs w:val="24"/>
-        </w:rPr>
-      </w:r>
-      <w:proofErr w:type="spellEnd"/>
-      <w:r>
-        <w:rPr>
-          <w:rFonts w:ascii="Times New Roman" w:hAnsi="Times New Roman" w:cs="Times New Roman"/>
-          <w:sz w:val="24"/>
-          <w:szCs w:val="24"/>
-        </w:rPr>
-      </w:r>
-      <w:proofErr w:type="spellStart"/>
-      <w:r>
-        <w:rPr>
-          <w:rFonts w:ascii="Times New Roman" w:hAnsi="Times New Roman" w:cs="Times New Roman"/>
-          <w:sz w:val="24"/>
-          <w:szCs w:val="24"/>
-        </w:rPr>
-      </w:r>
-      <w:proofErr w:type="spellEnd"/>
-      <w:r>
-        <w:rPr>
-          <w:rFonts w:ascii="Times New Roman" w:hAnsi="Times New Roman" w:cs="Times New Roman"/>
-          <w:sz w:val="24"/>
-          <w:szCs w:val="24"/>
-        </w:rPr>
-      </w:r>
-      <w:proofErr w:type="spellStart"/>
-      <w:r>
-        <w:rPr>
-          <w:rFonts w:ascii="Times New Roman" w:hAnsi="Times New Roman" w:cs="Times New Roman"/>
-          <w:sz w:val="24"/>
-          <w:szCs w:val="24"/>
-        </w:rPr>
-      </w:r>
-      <w:proofErr w:type="spellEnd"/>
-      <w:r>
-        <w:rPr>
-          <w:rFonts w:ascii="Times New Roman" w:hAnsi="Times New Roman" w:cs="Times New Roman"/>
-          <w:sz w:val="24"/>
-          <w:szCs w:val="24"/>
-        </w:rPr>
+        <w:t xml:space="preserve">In the Philippine educational context, the sustained implementation of digital learning platforms is influenced by practical constraints that limit teachers' capacity to </w:t>
+      </w:r>
+      <w:r>
+        <w:rPr>
+          <w:rFonts w:ascii="Times New Roman" w:hAnsi="Times New Roman" w:cs="Times New Roman"/>
+          <w:sz w:val="24"/>
+          <w:szCs w:val="24"/>
+        </w:rPr>
+        <w:lastRenderedPageBreak/>
+        <w:t>manage additional system processes. Balase and Paglinawan (2025) highlighted barriers to effective LMS integration in public schools, including unstable connectivity, limited technical support, digital literacy gaps, and workload management concerns. Accordingly, the mastery-based learning module in A.I.M.S. should be designed to support competency-based progression in a way that minimizes added teacher workload while maintaining clear performance thresholds and instructor oversight.</w:t>
       </w:r>
     </w:p>
     <w:p>
@@ -2870,77 +2394,6 @@
         </w:rPr>
         <w:t>Empirical evidence from the Philippine basic education context further affirms the value of structured remediation in supporting learner progression. Jumao-as et al. (2025) investigated the effectiveness of a reading remediation program implemented in a DepEd elementary school in Ozamiz City, Misamis Occidental, finding that Grade 4 pupils identified as having frustrated reading levels through the Philippine Informal Reading Inventory (PHIL-IRI) advanced to the instructional reading level following the systematic remediation program. The study demonstrated a statistically significant improvement in reading comprehension, validating that targeted, competency-specific intervention embedded within a structured instructional cycle produces measurable learning gains. These findings support the rationale for linking learner progression in A.I.M.S. to demonstrated mastery and structured remediation, even though the platform's specific lock and override controls remain part of the system's implementation design.</w:t>
       </w:r>
-      <w:proofErr w:type="spellStart"/>
-      <w:r>
-        <w:rPr>
-          <w:rFonts w:ascii="Times New Roman" w:hAnsi="Times New Roman" w:cs="Times New Roman"/>
-          <w:sz w:val="24"/>
-          <w:szCs w:val="24"/>
-        </w:rPr>
-      </w:r>
-      <w:proofErr w:type="spellEnd"/>
-      <w:r>
-        <w:rPr>
-          <w:rFonts w:ascii="Times New Roman" w:hAnsi="Times New Roman" w:cs="Times New Roman"/>
-          <w:sz w:val="24"/>
-          <w:szCs w:val="24"/>
-        </w:rPr>
-      </w:r>
-      <w:proofErr w:type="spellStart"/>
-      <w:r>
-        <w:rPr>
-          <w:rFonts w:ascii="Times New Roman" w:hAnsi="Times New Roman" w:cs="Times New Roman"/>
-          <w:sz w:val="24"/>
-          <w:szCs w:val="24"/>
-        </w:rPr>
-      </w:r>
-      <w:proofErr w:type="spellEnd"/>
-      <w:r>
-        <w:rPr>
-          <w:rFonts w:ascii="Times New Roman" w:hAnsi="Times New Roman" w:cs="Times New Roman"/>
-          <w:sz w:val="24"/>
-          <w:szCs w:val="24"/>
-        </w:rPr>
-      </w:r>
-      <w:proofErr w:type="spellStart"/>
-      <w:r>
-        <w:rPr>
-          <w:rFonts w:ascii="Times New Roman" w:hAnsi="Times New Roman" w:cs="Times New Roman"/>
-          <w:sz w:val="24"/>
-          <w:szCs w:val="24"/>
-        </w:rPr>
-      </w:r>
-      <w:proofErr w:type="spellEnd"/>
-      <w:r>
-        <w:rPr>
-          <w:rFonts w:ascii="Times New Roman" w:hAnsi="Times New Roman" w:cs="Times New Roman"/>
-          <w:sz w:val="24"/>
-          <w:szCs w:val="24"/>
-        </w:rPr>
-      </w:r>
-      <w:proofErr w:type="spellStart"/>
-      <w:r>
-        <w:rPr>
-          <w:rFonts w:ascii="Times New Roman" w:hAnsi="Times New Roman" w:cs="Times New Roman"/>
-          <w:sz w:val="24"/>
-          <w:szCs w:val="24"/>
-        </w:rPr>
-      </w:r>
-      <w:proofErr w:type="spellEnd"/>
-      <w:r>
-        <w:rPr>
-          <w:rFonts w:ascii="Times New Roman" w:hAnsi="Times New Roman" w:cs="Times New Roman"/>
-          <w:sz w:val="24"/>
-          <w:szCs w:val="24"/>
-        </w:rPr>
-      </w:r>
-      <w:r>
-        <w:rPr>
-          <w:rFonts w:ascii="Times New Roman" w:hAnsi="Times New Roman" w:cs="Times New Roman"/>
-          <w:sz w:val="24"/>
-          <w:szCs w:val="24"/>
-        </w:rPr>
-      </w:r>
     </w:p>
     <w:p>
       <w:pPr>
@@ -2991,14 +2444,8 @@
           <w:sz w:val="24"/>
           <w:szCs w:val="24"/>
         </w:rPr>
+        <w:lastRenderedPageBreak/>
         <w:t>The reviewed literature collectively demonstrates that each of the five core features of A.I.M.S. is grounded in a robust and growing body of empirical evidence. Centralized learning portal with material distribution and task submission supports structured access to learning materials and course activities in public school environments (Dahal &amp; Manandhar, 2024; Bustillo &amp; Aguilos, 2022), while AI-Powered Quiz Generator with instructor validation and approval controls reduces the cognitive and administrative burden of assessment creation through validated neural and LLM-based generation methods (Bulathwela et al., 2023; Alamoudi et al., 2025). Automated assessment and grading engine supporting teacher validation promotes evaluation consistency and scalability through machine learning and rubric-guided assessment (Ramesh &amp; Sanampudi, 2022; García-Varela et al., 2025). Dynamic remedial quiz generator for targeted student intervention is supported by literature on corrective feedback, targeted remediation, and structured intervention cycles aligned with identified learning gaps (Persky &amp; Hughes, 2022; Jumao-as et al., 2025). Finally, Mastery-based learning module with configurable progression locks is pedagogically grounded in mastery learning literature that emphasizes criterion-referenced progression, corrective feedback, and remediation before advancement (Persky &amp; Hughes, 2022; Jumao-as et al., 2025).</w:t>
-      </w:r>
-      <w:r>
-        <w:rPr>
-          <w:rFonts w:ascii="Times New Roman" w:hAnsi="Times New Roman" w:cs="Times New Roman"/>
-          <w:sz w:val="24"/>
-          <w:szCs w:val="24"/>
-        </w:rPr>
       </w:r>
     </w:p>
     <w:p>
@@ -3018,7 +2465,16 @@
           <w:sz w:val="24"/>
           <w:szCs w:val="24"/>
         </w:rPr>
-        <w:t>A consistent theme across both foreign and local literature is that the effectiveness of educational technology solutions depends not only on technical capability but also on contextual fit with teacher workflows and implementation constraints. Local evidence highlights persistent barriers such as unstable connectivity, limited technical support, digital literacy gaps, and workload management concerns that shape platform adoption in Philippine public schools (Balase &amp; Paglinawan, 2025; Colegado, 2025). Across the reviewed studies, core functionalities such as centralized content distribution, AI-assisted assessment creation, automated grading, targeted remediation, and mastery-based progression are commonly investigated as distinct solutions. This indicates a continuing research and design opportunity to integrate the complete instructional and assessment cycle within a single, teacher-centered platform, as envisioned in A.I.M.S.</w:t>
+        <w:t xml:space="preserve">A consistent theme across both foreign and local literature is that the effectiveness of educational technology solutions depends not only on technical capability but also on contextual fit with teacher workflows and implementation constraints. Local evidence highlights persistent barriers such as unstable connectivity, limited technical support, digital literacy gaps, and workload management concerns that shape platform adoption in </w:t>
+      </w:r>
+      <w:r>
+        <w:rPr>
+          <w:rFonts w:ascii="Times New Roman" w:hAnsi="Times New Roman" w:cs="Times New Roman"/>
+          <w:sz w:val="24"/>
+          <w:szCs w:val="24"/>
+        </w:rPr>
+        <w:lastRenderedPageBreak/>
+        <w:t>Philippine public schools (Balase &amp; Paglinawan, 2025; Colegado, 2025). Across the reviewed studies, core functionalities such as centralized content distribution, AI-assisted assessment creation, automated grading, targeted remediation, and mastery-based progression are commonly investigated as distinct solutions. This indicates a continuing research and design opportunity to integrate the complete instructional and assessment cycle within a single, teacher-centered platform, as envisioned in A.I.M.S.</w:t>
       </w:r>
     </w:p>
     <w:p>
@@ -3038,16 +2494,7 @@
           <w:sz w:val="24"/>
           <w:szCs w:val="24"/>
         </w:rPr>
-        <w:t xml:space="preserve">Overall, the literature reviewed in this chapter provides strong theoretical, empirical, and contextual justification for the design and development of A.I.M.S. as a unified, AI-driven educational platform tailored to the Philippine public school context. The evidence base confirms that the proposed features are not merely technically feasible but also pedagogically sound, contextually responsive, and aligned with contemporary best practices in educational technology research. By operationalizing verified AI capabilities within a coherent, teacher-centered system architecture, A.I.M.S. represents a research-supported response to documented gaps in Philippine digital learning environments, </w:t>
-      </w:r>
-      <w:r>
-        <w:rPr>
-          <w:rFonts w:ascii="Times New Roman" w:hAnsi="Times New Roman" w:cs="Times New Roman"/>
-          <w:sz w:val="24"/>
-          <w:szCs w:val="24"/>
-        </w:rPr>
-        <w:lastRenderedPageBreak/>
-        <w:t>integrating access management, automated assessment, targeted remediation, and mastery-based progression into a single, scalable educa</w:t>
+        <w:t xml:space="preserve">Overall, the literature reviewed in this chapter provides strong theoretical, empirical, and contextual justification for the design and development of A.I.M.S. as a unified, AI-driven educational platform tailored to the Philippine public school context. The evidence base confirms that the </w:t>
       </w:r>
       <w:bookmarkStart w:id="2" w:name="_GoBack"/>
       <w:bookmarkEnd w:id="2"/>
@@ -3057,7 +2504,7 @@
           <w:sz w:val="24"/>
           <w:szCs w:val="24"/>
         </w:rPr>
-        <w:t>tional system.</w:t>
+        <w:t>proposed features are not merely technically feasible but also pedagogically sound, contextually responsive, and aligned with contemporary best practices in educational technology research. By operationalizing verified AI capabilities within a coherent, teacher-centered system architecture, A.I.M.S. represents a research-supported response to documented gaps in Philippine digital learning environments, integrating access management, automated assessment, targeted remediation, and mastery-based progression into a single, scalable educational system.</w:t>
       </w:r>
     </w:p>
     <w:p>
@@ -3224,6 +2671,7 @@
                 <w:sz w:val="24"/>
                 <w:szCs w:val="24"/>
               </w:rPr>
+              <w:lastRenderedPageBreak/>
               <w:t>Studies/System</w:t>
             </w:r>
           </w:p>
@@ -3345,25 +2793,7 @@
                 <w:sz w:val="24"/>
                 <w:szCs w:val="24"/>
               </w:rPr>
-              <w:t xml:space="preserve">Optimizing Automated Question Generation for Educational Assessments – </w:t>
-            </w:r>
-            <w:proofErr w:type="spellStart"/>
-            <w:r>
-              <w:rPr>
-                <w:rFonts w:ascii="Times New Roman" w:eastAsia="Times New Roman" w:hAnsi="Times New Roman" w:cs="Times New Roman"/>
-                <w:sz w:val="24"/>
-                <w:szCs w:val="24"/>
-              </w:rPr>
-              <w:t>Alamoudi</w:t>
-            </w:r>
-            <w:proofErr w:type="spellEnd"/>
-            <w:r>
-              <w:rPr>
-                <w:rFonts w:ascii="Times New Roman" w:eastAsia="Times New Roman" w:hAnsi="Times New Roman" w:cs="Times New Roman"/>
-                <w:sz w:val="24"/>
-                <w:szCs w:val="24"/>
-              </w:rPr>
-              <w:t xml:space="preserve"> et al. (2025)</w:t>
+              <w:t>Optimizing Automated Question Generation for Educational Assessments – Alamoudi et al. (2025)</w:t>
             </w:r>
           </w:p>
         </w:tc>
@@ -3673,25 +3103,7 @@
                 <w:sz w:val="24"/>
                 <w:szCs w:val="24"/>
               </w:rPr>
-              <w:t xml:space="preserve">Review on Neural Question Generation for Education Purposes – </w:t>
-            </w:r>
-            <w:proofErr w:type="spellStart"/>
-            <w:r>
-              <w:rPr>
-                <w:rFonts w:ascii="Times New Roman" w:eastAsia="Times New Roman" w:hAnsi="Times New Roman" w:cs="Times New Roman"/>
-                <w:sz w:val="24"/>
-                <w:szCs w:val="24"/>
-              </w:rPr>
-              <w:t>Bulathwela</w:t>
-            </w:r>
-            <w:proofErr w:type="spellEnd"/>
-            <w:r>
-              <w:rPr>
-                <w:rFonts w:ascii="Times New Roman" w:eastAsia="Times New Roman" w:hAnsi="Times New Roman" w:cs="Times New Roman"/>
-                <w:sz w:val="24"/>
-                <w:szCs w:val="24"/>
-              </w:rPr>
-              <w:t xml:space="preserve"> et al. (2023)</w:t>
+              <w:t>Review on Neural Question Generation for Education Purposes – Bulathwela et al. (2023)</w:t>
             </w:r>
           </w:p>
         </w:tc>
@@ -3840,41 +3252,13 @@
                 <w:szCs w:val="24"/>
               </w:rPr>
             </w:pPr>
-            <w:proofErr w:type="spellStart"/>
             <w:r>
               <w:rPr>
                 <w:rFonts w:ascii="Times New Roman" w:eastAsia="Times New Roman" w:hAnsi="Times New Roman" w:cs="Times New Roman"/>
                 <w:sz w:val="24"/>
                 <w:szCs w:val="24"/>
               </w:rPr>
-              <w:t>ChatGPT</w:t>
-            </w:r>
-            <w:proofErr w:type="spellEnd"/>
-            <w:r>
-              <w:rPr>
-                <w:rFonts w:ascii="Times New Roman" w:eastAsia="Times New Roman" w:hAnsi="Times New Roman" w:cs="Times New Roman"/>
-                <w:sz w:val="24"/>
-                <w:szCs w:val="24"/>
-              </w:rPr>
-              <w:t xml:space="preserve"> as a Stable and Fair Tool for Automated Essay Scoring – </w:t>
-            </w:r>
-            <w:proofErr w:type="spellStart"/>
-            <w:r>
-              <w:rPr>
-                <w:rFonts w:ascii="Times New Roman" w:eastAsia="Times New Roman" w:hAnsi="Times New Roman" w:cs="Times New Roman"/>
-                <w:sz w:val="24"/>
-                <w:szCs w:val="24"/>
-              </w:rPr>
-              <w:t>García</w:t>
-            </w:r>
-            <w:proofErr w:type="spellEnd"/>
-            <w:r>
-              <w:rPr>
-                <w:rFonts w:ascii="Times New Roman" w:eastAsia="Times New Roman" w:hAnsi="Times New Roman" w:cs="Times New Roman"/>
-                <w:sz w:val="24"/>
-                <w:szCs w:val="24"/>
-              </w:rPr>
-              <w:t>-Varela et al. (2025)</w:t>
+              <w:t>ChatGPT as a Stable and Fair Tool for Automated Essay Scoring – García-Varela et al. (2025)</w:t>
             </w:r>
           </w:p>
         </w:tc>
@@ -4029,25 +3413,7 @@
                 <w:sz w:val="24"/>
                 <w:szCs w:val="24"/>
               </w:rPr>
-              <w:t xml:space="preserve">A Practical Review of Mastery Learning – </w:t>
-            </w:r>
-            <w:proofErr w:type="spellStart"/>
-            <w:r>
-              <w:rPr>
-                <w:rFonts w:ascii="Times New Roman" w:eastAsia="Times New Roman" w:hAnsi="Times New Roman" w:cs="Times New Roman"/>
-                <w:sz w:val="24"/>
-                <w:szCs w:val="24"/>
-              </w:rPr>
-              <w:t>Persky</w:t>
-            </w:r>
-            <w:proofErr w:type="spellEnd"/>
-            <w:r>
-              <w:rPr>
-                <w:rFonts w:ascii="Times New Roman" w:eastAsia="Times New Roman" w:hAnsi="Times New Roman" w:cs="Times New Roman"/>
-                <w:sz w:val="24"/>
-                <w:szCs w:val="24"/>
-              </w:rPr>
-              <w:t xml:space="preserve"> &amp; Hughes (2022)</w:t>
+              <w:t>A Practical Review of Mastery Learning – Persky &amp; Hughes (2022)</w:t>
             </w:r>
           </w:p>
         </w:tc>
@@ -4202,25 +3568,7 @@
                 <w:sz w:val="24"/>
                 <w:szCs w:val="24"/>
               </w:rPr>
-              <w:t xml:space="preserve">An Automated Essay Scoring Systems: A Systematic Literature Review – Ramesh &amp; </w:t>
-            </w:r>
-            <w:proofErr w:type="spellStart"/>
-            <w:r>
-              <w:rPr>
-                <w:rFonts w:ascii="Times New Roman" w:eastAsia="Times New Roman" w:hAnsi="Times New Roman" w:cs="Times New Roman"/>
-                <w:sz w:val="24"/>
-                <w:szCs w:val="24"/>
-              </w:rPr>
-              <w:t>Sanampudi</w:t>
-            </w:r>
-            <w:proofErr w:type="spellEnd"/>
-            <w:r>
-              <w:rPr>
-                <w:rFonts w:ascii="Times New Roman" w:eastAsia="Times New Roman" w:hAnsi="Times New Roman" w:cs="Times New Roman"/>
-                <w:sz w:val="24"/>
-                <w:szCs w:val="24"/>
-              </w:rPr>
-              <w:t xml:space="preserve"> (2022)</w:t>
+              <w:t>An Automated Essay Scoring Systems: A Systematic Literature Review – Ramesh &amp; Sanampudi (2022)</w:t>
             </w:r>
           </w:p>
         </w:tc>
@@ -4375,25 +3723,7 @@
                 <w:sz w:val="24"/>
                 <w:szCs w:val="24"/>
               </w:rPr>
-              <w:t xml:space="preserve">The Challenges of Modular Learning in the Wake of COVID-19: A Digital Divide in the Philippine Countryside Revealed – Bustillo &amp; </w:t>
-            </w:r>
-            <w:proofErr w:type="spellStart"/>
-            <w:r>
-              <w:rPr>
-                <w:rFonts w:ascii="Times New Roman" w:eastAsia="Times New Roman" w:hAnsi="Times New Roman" w:cs="Times New Roman"/>
-                <w:sz w:val="24"/>
-                <w:szCs w:val="24"/>
-              </w:rPr>
-              <w:t>Aguilos</w:t>
-            </w:r>
-            <w:proofErr w:type="spellEnd"/>
-            <w:r>
-              <w:rPr>
-                <w:rFonts w:ascii="Times New Roman" w:eastAsia="Times New Roman" w:hAnsi="Times New Roman" w:cs="Times New Roman"/>
-                <w:sz w:val="24"/>
-                <w:szCs w:val="24"/>
-              </w:rPr>
-              <w:t xml:space="preserve"> (2022)</w:t>
+              <w:t>The Challenges of Modular Learning in the Wake of COVID-19: A Digital Divide in the Philippine Countryside Revealed – Bustillo &amp; Aguilos (2022)</w:t>
             </w:r>
           </w:p>
         </w:tc>
@@ -4548,62 +3878,7 @@
                 <w:sz w:val="24"/>
                 <w:szCs w:val="24"/>
               </w:rPr>
-              <w:lastRenderedPageBreak/>
-              <w:t xml:space="preserve">Voices from the Field: Teachers' Narratives and Reflections on Integrating the </w:t>
-            </w:r>
-            <w:proofErr w:type="spellStart"/>
-            <w:r>
-              <w:rPr>
-                <w:rFonts w:ascii="Times New Roman" w:eastAsia="Times New Roman" w:hAnsi="Times New Roman" w:cs="Times New Roman"/>
-                <w:sz w:val="24"/>
-                <w:szCs w:val="24"/>
-              </w:rPr>
-              <w:t>DepEd</w:t>
-            </w:r>
-            <w:proofErr w:type="spellEnd"/>
-            <w:r>
-              <w:rPr>
-                <w:rFonts w:ascii="Times New Roman" w:eastAsia="Times New Roman" w:hAnsi="Times New Roman" w:cs="Times New Roman"/>
-                <w:sz w:val="24"/>
-                <w:szCs w:val="24"/>
-              </w:rPr>
-              <w:t xml:space="preserve"> LMS – </w:t>
-            </w:r>
-            <w:proofErr w:type="spellStart"/>
-            <w:r>
-              <w:rPr>
-                <w:rFonts w:ascii="Times New Roman" w:eastAsia="Times New Roman" w:hAnsi="Times New Roman" w:cs="Times New Roman"/>
-                <w:sz w:val="24"/>
-                <w:szCs w:val="24"/>
-              </w:rPr>
-              <w:t>Balase</w:t>
-            </w:r>
-            <w:proofErr w:type="spellEnd"/>
-            <w:r>
-              <w:rPr>
-                <w:rFonts w:ascii="Times New Roman" w:eastAsia="Times New Roman" w:hAnsi="Times New Roman" w:cs="Times New Roman"/>
-                <w:sz w:val="24"/>
-                <w:szCs w:val="24"/>
-              </w:rPr>
-              <w:t xml:space="preserve"> &amp; </w:t>
-            </w:r>
-            <w:proofErr w:type="spellStart"/>
-            <w:r>
-              <w:rPr>
-                <w:rFonts w:ascii="Times New Roman" w:eastAsia="Times New Roman" w:hAnsi="Times New Roman" w:cs="Times New Roman"/>
-                <w:sz w:val="24"/>
-                <w:szCs w:val="24"/>
-              </w:rPr>
-              <w:t>Paglinawan</w:t>
-            </w:r>
-            <w:proofErr w:type="spellEnd"/>
-            <w:r>
-              <w:rPr>
-                <w:rFonts w:ascii="Times New Roman" w:eastAsia="Times New Roman" w:hAnsi="Times New Roman" w:cs="Times New Roman"/>
-                <w:sz w:val="24"/>
-                <w:szCs w:val="24"/>
-              </w:rPr>
-              <w:t xml:space="preserve"> (2025)</w:t>
+              <w:t>Voices from the Field: Teachers' Narratives and Reflections on Integrating the DepEd LMS – Balase &amp; Paglinawan (2025)</w:t>
             </w:r>
           </w:p>
         </w:tc>
@@ -4758,25 +4033,7 @@
                 <w:sz w:val="24"/>
                 <w:szCs w:val="24"/>
               </w:rPr>
-              <w:t xml:space="preserve">Digital Innovations in Science Education in the Philippines: A Scoping Review – </w:t>
-            </w:r>
-            <w:proofErr w:type="spellStart"/>
-            <w:r>
-              <w:rPr>
-                <w:rFonts w:ascii="Times New Roman" w:eastAsia="Times New Roman" w:hAnsi="Times New Roman" w:cs="Times New Roman"/>
-                <w:sz w:val="24"/>
-                <w:szCs w:val="24"/>
-              </w:rPr>
-              <w:t>Colegado</w:t>
-            </w:r>
-            <w:proofErr w:type="spellEnd"/>
-            <w:r>
-              <w:rPr>
-                <w:rFonts w:ascii="Times New Roman" w:eastAsia="Times New Roman" w:hAnsi="Times New Roman" w:cs="Times New Roman"/>
-                <w:sz w:val="24"/>
-                <w:szCs w:val="24"/>
-              </w:rPr>
-              <w:t xml:space="preserve"> (2025)</w:t>
+              <w:t>Digital Innovations in Science Education in the Philippines: A Scoping Review – Colegado (2025)</w:t>
             </w:r>
           </w:p>
         </w:tc>
@@ -4931,25 +4188,7 @@
                 <w:sz w:val="24"/>
                 <w:szCs w:val="24"/>
               </w:rPr>
-              <w:t xml:space="preserve">Reading Remediation Program and Grade 4 Pupils' Reading Comprehension – </w:t>
-            </w:r>
-            <w:proofErr w:type="spellStart"/>
-            <w:r>
-              <w:rPr>
-                <w:rFonts w:ascii="Times New Roman" w:eastAsia="Times New Roman" w:hAnsi="Times New Roman" w:cs="Times New Roman"/>
-                <w:sz w:val="24"/>
-                <w:szCs w:val="24"/>
-              </w:rPr>
-              <w:t>Jumao</w:t>
-            </w:r>
-            <w:proofErr w:type="spellEnd"/>
-            <w:r>
-              <w:rPr>
-                <w:rFonts w:ascii="Times New Roman" w:eastAsia="Times New Roman" w:hAnsi="Times New Roman" w:cs="Times New Roman"/>
-                <w:sz w:val="24"/>
-                <w:szCs w:val="24"/>
-              </w:rPr>
-              <w:t>-as et al. (2025)</w:t>
+              <w:t>Reading Remediation Program and Grade 4 Pupils' Reading Comprehension – Jumao-as et al. (2025)</w:t>
             </w:r>
           </w:p>
         </w:tc>
@@ -5128,6 +4367,7 @@
           <w:sz w:val="24"/>
           <w:szCs w:val="24"/>
         </w:rPr>
+        <w:lastRenderedPageBreak/>
         <w:t>The matrix of related literature and studies above presents a comparative overview of existing systems and studies in relation to the five core technical features of the proposed A.I.M.S. platform. The studies mapped in the matrix span both foreign and local literature, covering Centralized learning portal with material distribution and task submission (Dahal &amp; Manandhar, 2024; Bustillo &amp; Aguilos, 2022), AI-Powered Quiz Generator with instructor validation and approval controls (Bulathwela et al., 2023; Alamoudi et al., 2025), Automated assessment and grading engine supporting teacher validation (Ramesh &amp; Sanampudi, 2022; García-Varela et al., 2025), Dynamic remedial quiz generator for targeted student intervention (Persky &amp; Hughes, 2022; Jumao-as et al., 2025), and Mastery-based learning module with configurable progression locks (Persky &amp; Hughes, 2022; Jumao-as et al., 2025).</w:t>
       </w:r>
     </w:p>
@@ -5148,16 +4388,7 @@
           <w:sz w:val="24"/>
           <w:szCs w:val="24"/>
         </w:rPr>
-        <w:t xml:space="preserve">Overall, the synthesis reveals that while the individual features addressed by A.I.M.S. are present in existing systems and have been independently validated in the literature, no single platform currently integrates all five functionalities: Centralized learning portal with material distribution and task submission, AI-Powered Quiz Generator </w:t>
-      </w:r>
-      <w:r>
-        <w:rPr>
-          <w:rFonts w:ascii="Times New Roman" w:hAnsi="Times New Roman" w:cs="Times New Roman"/>
-          <w:sz w:val="24"/>
-          <w:szCs w:val="24"/>
-        </w:rPr>
-        <w:lastRenderedPageBreak/>
-        <w:t>with instructor validation and approval controls, Automated assessment and grading engine supporting teacher validation, Dynamic remedial quiz generator for targeted student intervention, and Mastery-based learning module with configurable progression locks, into a unified, AI-driven educational environment. This integration gap constitutes the primary research contribution of A.I.M.S. and affirms the novelty and practical significance of the proposed system as a response to documented needs in the Philippine educational technology landscape.</w:t>
+        <w:t>Overall, the synthesis reveals that while the individual features addressed by A.I.M.S. are present in existing systems and have been independently validated in the literature, no single platform currently integrates all five functionalities: Centralized learning portal with material distribution and task submission, AI-Powered Quiz Generator with instructor validation and approval controls, Automated assessment and grading engine supporting teacher validation, Dynamic remedial quiz generator for targeted student intervention, and Mastery-based learning module with configurable progression locks, into a unified, AI-driven educational environment. This integration gap constitutes the primary research contribution of A.I.M.S. and affirms the novelty and practical significance of the proposed system as a response to documented needs in the Philippine educational technology landscape.</w:t>
       </w:r>
     </w:p>
     <w:p>
@@ -5249,37 +4480,12 @@
         <w:ind w:left="720" w:hanging="720"/>
         <w:jc w:val="both"/>
       </w:pPr>
-      <w:proofErr w:type="spellStart"/>
       <w:r>
         <w:rPr>
           <w:rFonts w:ascii="Times New Roman" w:hAnsi="Times New Roman"/>
           <w:sz w:val="24"/>
         </w:rPr>
-        <w:t>Alamoudi</w:t>
-      </w:r>
-      <w:proofErr w:type="spellEnd"/>
-      <w:r>
-        <w:rPr>
-          <w:rFonts w:ascii="Times New Roman" w:hAnsi="Times New Roman"/>
-          <w:sz w:val="24"/>
-        </w:rPr>
-        <w:t xml:space="preserve">, S., Al </w:t>
-      </w:r>
-      <w:proofErr w:type="spellStart"/>
-      <w:r>
-        <w:rPr>
-          <w:rFonts w:ascii="Times New Roman" w:hAnsi="Times New Roman"/>
-          <w:sz w:val="24"/>
-        </w:rPr>
-        <w:t>Khuzayem</w:t>
-      </w:r>
-      <w:proofErr w:type="spellEnd"/>
-      <w:r>
-        <w:rPr>
-          <w:rFonts w:ascii="Times New Roman" w:hAnsi="Times New Roman"/>
-          <w:sz w:val="24"/>
-        </w:rPr>
-        <w:t xml:space="preserve">, L. A., &amp; Jamal, A. (2025). Optimizing automated question generation for educational assessments: A semantic analysis of LLMs with structured and unstructured ontologies. </w:t>
+        <w:t xml:space="preserve">Alamoudi, S., Al Khuzayem, L. A., &amp; Jamal, A. (2025). Optimizing automated question generation for educational assessments: A semantic analysis of LLMs with structured and unstructured ontologies. </w:t>
       </w:r>
       <w:r>
         <w:rPr>
@@ -5320,53 +4526,12 @@
         <w:ind w:left="720" w:hanging="720"/>
         <w:jc w:val="both"/>
       </w:pPr>
-      <w:proofErr w:type="spellStart"/>
       <w:r>
         <w:rPr>
           <w:rFonts w:ascii="Times New Roman" w:hAnsi="Times New Roman"/>
           <w:sz w:val="24"/>
         </w:rPr>
-        <w:t>Balase</w:t>
-      </w:r>
-      <w:proofErr w:type="spellEnd"/>
-      <w:r>
-        <w:rPr>
-          <w:rFonts w:ascii="Times New Roman" w:hAnsi="Times New Roman"/>
-          <w:sz w:val="24"/>
-        </w:rPr>
-        <w:t xml:space="preserve">, M. M. H., &amp; </w:t>
-      </w:r>
-      <w:proofErr w:type="spellStart"/>
-      <w:r>
-        <w:rPr>
-          <w:rFonts w:ascii="Times New Roman" w:hAnsi="Times New Roman"/>
-          <w:sz w:val="24"/>
-        </w:rPr>
-        <w:t>Paglinawan</w:t>
-      </w:r>
-      <w:proofErr w:type="spellEnd"/>
-      <w:r>
-        <w:rPr>
-          <w:rFonts w:ascii="Times New Roman" w:hAnsi="Times New Roman"/>
-          <w:sz w:val="24"/>
-        </w:rPr>
-        <w:t xml:space="preserve">, J. L. (2025). Voices from the field: Teachers' narratives and reflections on integrating the </w:t>
-      </w:r>
-      <w:proofErr w:type="spellStart"/>
-      <w:r>
-        <w:rPr>
-          <w:rFonts w:ascii="Times New Roman" w:hAnsi="Times New Roman"/>
-          <w:sz w:val="24"/>
-        </w:rPr>
-        <w:t>DepEd</w:t>
-      </w:r>
-      <w:proofErr w:type="spellEnd"/>
-      <w:r>
-        <w:rPr>
-          <w:rFonts w:ascii="Times New Roman" w:hAnsi="Times New Roman"/>
-          <w:sz w:val="24"/>
-        </w:rPr>
-        <w:t xml:space="preserve"> Learning Management System (LMS) in teaching and professional development. </w:t>
+        <w:t xml:space="preserve">Balase, M. M. H., &amp; Paglinawan, J. L. (2025). Voices from the field: Teachers' narratives and reflections on integrating the DepEd Learning Management System (LMS) in teaching and professional development. </w:t>
       </w:r>
       <w:r>
         <w:rPr>
@@ -5408,7 +4573,18 @@
         <w:jc w:val="both"/>
       </w:pPr>
       <w:r>
-        <w:t>Dahal, N., &amp; Manandhar, N. (2024). The reality of e-learning: Success and failure of learning management system. Advances in Mobile Learning Educational Research, 4(1), 903–910. https://doi.org/10.25082/amler.2024.01.001</w:t>
+        <w:t xml:space="preserve">Dahal, N., &amp; Manandhar, N. (2024). The reality of e-learning: Success and failure of learning management system. Advances in Mobile Learning Educational Research, 4(1), 903–910. </w:t>
+      </w:r>
+      <w:hyperlink r:id="rId8" w:history="1">
+        <w:r>
+          <w:rPr>
+            <w:rStyle w:val="Hyperlink"/>
+          </w:rPr>
+          <w:t>https://doi.org/10.25082/amler.2024.01.001</w:t>
+        </w:r>
+      </w:hyperlink>
+      <w:r>
+        <w:t xml:space="preserve"> </w:t>
       </w:r>
     </w:p>
     <w:p>
@@ -5417,53 +4593,12 @@
         <w:ind w:left="720" w:hanging="720"/>
         <w:jc w:val="both"/>
       </w:pPr>
-      <w:proofErr w:type="spellStart"/>
       <w:r>
         <w:rPr>
           <w:rFonts w:ascii="Times New Roman" w:hAnsi="Times New Roman"/>
           <w:sz w:val="24"/>
         </w:rPr>
-        <w:t>Bulathwela</w:t>
-      </w:r>
-      <w:proofErr w:type="spellEnd"/>
-      <w:r>
-        <w:rPr>
-          <w:rFonts w:ascii="Times New Roman" w:hAnsi="Times New Roman"/>
-          <w:sz w:val="24"/>
-        </w:rPr>
-        <w:t xml:space="preserve">, S., Pérez-Ortiz, M., Holloway, C., </w:t>
-      </w:r>
-      <w:proofErr w:type="spellStart"/>
-      <w:r>
-        <w:rPr>
-          <w:rFonts w:ascii="Times New Roman" w:hAnsi="Times New Roman"/>
-          <w:sz w:val="24"/>
-        </w:rPr>
-        <w:t>Cukurova</w:t>
-      </w:r>
-      <w:proofErr w:type="spellEnd"/>
-      <w:r>
-        <w:rPr>
-          <w:rFonts w:ascii="Times New Roman" w:hAnsi="Times New Roman"/>
-          <w:sz w:val="24"/>
-        </w:rPr>
-        <w:t xml:space="preserve">, M., &amp; </w:t>
-      </w:r>
-      <w:proofErr w:type="spellStart"/>
-      <w:r>
-        <w:rPr>
-          <w:rFonts w:ascii="Times New Roman" w:hAnsi="Times New Roman"/>
-          <w:sz w:val="24"/>
-        </w:rPr>
-        <w:t>Shawe</w:t>
-      </w:r>
-      <w:proofErr w:type="spellEnd"/>
-      <w:r>
-        <w:rPr>
-          <w:rFonts w:ascii="Times New Roman" w:hAnsi="Times New Roman"/>
-          <w:sz w:val="24"/>
-        </w:rPr>
-        <w:t xml:space="preserve">-Taylor, J. (2023). Review on neural question generation for education purposes. </w:t>
+        <w:t xml:space="preserve">Bulathwela, S., Pérez-Ortiz, M., Holloway, C., Cukurova, M., &amp; Shawe-Taylor, J. (2023). Review on neural question generation for education purposes. </w:t>
       </w:r>
       <w:r>
         <w:rPr>
@@ -5509,23 +4644,7 @@
           <w:rFonts w:ascii="Times New Roman" w:hAnsi="Times New Roman"/>
           <w:sz w:val="24"/>
         </w:rPr>
-        <w:t xml:space="preserve">Bustillo, E., &amp; </w:t>
-      </w:r>
-      <w:proofErr w:type="spellStart"/>
-      <w:r>
-        <w:rPr>
-          <w:rFonts w:ascii="Times New Roman" w:hAnsi="Times New Roman"/>
-          <w:sz w:val="24"/>
-        </w:rPr>
-        <w:t>Aguilos</w:t>
-      </w:r>
-      <w:proofErr w:type="spellEnd"/>
-      <w:r>
-        <w:rPr>
-          <w:rFonts w:ascii="Times New Roman" w:hAnsi="Times New Roman"/>
-          <w:sz w:val="24"/>
-        </w:rPr>
-        <w:t xml:space="preserve">, M. (2022). The challenges of modular learning in the wake of COVID-19: A digital divide in the Philippine countryside revealed. </w:t>
+        <w:t xml:space="preserve">Bustillo, E., &amp; Aguilos, M. (2022). The challenges of modular learning in the wake of COVID-19: A digital divide in the Philippine countryside revealed. </w:t>
       </w:r>
       <w:r>
         <w:rPr>
@@ -5566,21 +4685,12 @@
         <w:ind w:left="720" w:hanging="720"/>
         <w:jc w:val="both"/>
       </w:pPr>
-      <w:proofErr w:type="spellStart"/>
       <w:r>
         <w:rPr>
           <w:rFonts w:ascii="Times New Roman" w:hAnsi="Times New Roman"/>
           <w:sz w:val="24"/>
         </w:rPr>
-        <w:t>Colegado</w:t>
-      </w:r>
-      <w:proofErr w:type="spellEnd"/>
-      <w:r>
-        <w:rPr>
-          <w:rFonts w:ascii="Times New Roman" w:hAnsi="Times New Roman"/>
-          <w:sz w:val="24"/>
-        </w:rPr>
-        <w:t xml:space="preserve">, J. C. (2025). Digital innovations in science education in the Philippines: A scoping review of teaching practices and tools. </w:t>
+        <w:t xml:space="preserve">Colegado, J. C. (2025). Digital innovations in science education in the Philippines: A scoping review of teaching practices and tools. </w:t>
       </w:r>
       <w:r>
         <w:rPr>
@@ -5630,69 +4740,12 @@
         <w:ind w:left="720" w:hanging="720"/>
         <w:jc w:val="both"/>
       </w:pPr>
-      <w:proofErr w:type="spellStart"/>
       <w:r>
         <w:rPr>
           <w:rFonts w:ascii="Times New Roman" w:hAnsi="Times New Roman"/>
           <w:sz w:val="24"/>
         </w:rPr>
-        <w:t>García</w:t>
-      </w:r>
-      <w:proofErr w:type="spellEnd"/>
-      <w:r>
-        <w:rPr>
-          <w:rFonts w:ascii="Times New Roman" w:hAnsi="Times New Roman"/>
-          <w:sz w:val="24"/>
-        </w:rPr>
-        <w:t xml:space="preserve">-Varela, F., Nussbaum, M., Mendoza, M., </w:t>
-      </w:r>
-      <w:proofErr w:type="spellStart"/>
-      <w:r>
-        <w:rPr>
-          <w:rFonts w:ascii="Times New Roman" w:hAnsi="Times New Roman"/>
-          <w:sz w:val="24"/>
-        </w:rPr>
-        <w:t>Martínez-Troncoso</w:t>
-      </w:r>
-      <w:proofErr w:type="spellEnd"/>
-      <w:r>
-        <w:rPr>
-          <w:rFonts w:ascii="Times New Roman" w:hAnsi="Times New Roman"/>
-          <w:sz w:val="24"/>
-        </w:rPr>
-        <w:t xml:space="preserve">, C., &amp; </w:t>
-      </w:r>
-      <w:proofErr w:type="spellStart"/>
-      <w:r>
-        <w:rPr>
-          <w:rFonts w:ascii="Times New Roman" w:hAnsi="Times New Roman"/>
-          <w:sz w:val="24"/>
-        </w:rPr>
-        <w:t>Bekerman</w:t>
-      </w:r>
-      <w:proofErr w:type="spellEnd"/>
-      <w:r>
-        <w:rPr>
-          <w:rFonts w:ascii="Times New Roman" w:hAnsi="Times New Roman"/>
-          <w:sz w:val="24"/>
-        </w:rPr>
-        <w:t xml:space="preserve">, Z. (2025). </w:t>
-      </w:r>
-      <w:proofErr w:type="spellStart"/>
-      <w:r>
-        <w:rPr>
-          <w:rFonts w:ascii="Times New Roman" w:hAnsi="Times New Roman"/>
-          <w:sz w:val="24"/>
-        </w:rPr>
-        <w:t>ChatGPT</w:t>
-      </w:r>
-      <w:proofErr w:type="spellEnd"/>
-      <w:r>
-        <w:rPr>
-          <w:rFonts w:ascii="Times New Roman" w:hAnsi="Times New Roman"/>
-          <w:sz w:val="24"/>
-        </w:rPr>
-        <w:t xml:space="preserve"> as a stable and fair tool for automated essay scoring. </w:t>
+        <w:t xml:space="preserve">García-Varela, F., Nussbaum, M., Mendoza, M., Martínez-Troncoso, C., &amp; Bekerman, Z. (2025). ChatGPT as a stable and fair tool for automated essay scoring. </w:t>
       </w:r>
       <w:r>
         <w:rPr>
@@ -5707,7 +4760,40 @@
           <w:rFonts w:ascii="Times New Roman" w:hAnsi="Times New Roman"/>
           <w:sz w:val="24"/>
         </w:rPr>
-        <w:t>(8), Article 946. https://doi.org/10.3390/educsci15080946</w:t>
+        <w:t xml:space="preserve">(8), Article 946. </w:t>
+      </w:r>
+      <w:hyperlink r:id="rId12" w:history="1">
+        <w:r>
+          <w:rPr>
+            <w:rStyle w:val="Hyperlink"/>
+            <w:rFonts w:ascii="Times New Roman" w:hAnsi="Times New Roman"/>
+            <w:sz w:val="24"/>
+          </w:rPr>
+          <w:t>https://doi.org/10.3390/educs</w:t>
+        </w:r>
+        <w:r>
+          <w:rPr>
+            <w:rStyle w:val="Hyperlink"/>
+            <w:rFonts w:ascii="Times New Roman" w:hAnsi="Times New Roman"/>
+            <w:sz w:val="24"/>
+          </w:rPr>
+          <w:t>c</w:t>
+        </w:r>
+        <w:r>
+          <w:rPr>
+            <w:rStyle w:val="Hyperlink"/>
+            <w:rFonts w:ascii="Times New Roman" w:hAnsi="Times New Roman"/>
+            <w:sz w:val="24"/>
+          </w:rPr>
+          <w:t>i15080946</w:t>
+        </w:r>
+      </w:hyperlink>
+      <w:r>
+        <w:rPr>
+          <w:rFonts w:ascii="Times New Roman" w:hAnsi="Times New Roman"/>
+          <w:sz w:val="24"/>
+        </w:rPr>
+        <w:t xml:space="preserve"> </w:t>
       </w:r>
     </w:p>
     <w:p>
@@ -5729,34 +4815,16 @@
           <w:i/>
           <w:sz w:val="24"/>
         </w:rPr>
-        <w:t>Systems and software engineering—Systems and software Quality Requirements and Evaluation (</w:t>
-      </w:r>
-      <w:proofErr w:type="spellStart"/>
+        <w:t>Systems and software engineering—Systems and software Quality Requirements and Evaluation (SQuaRE)—System and software quality models</w:t>
+      </w:r>
       <w:r>
         <w:rPr>
           <w:rFonts w:ascii="Times New Roman" w:hAnsi="Times New Roman"/>
-          <w:i/>
-          <w:sz w:val="24"/>
-        </w:rPr>
-        <w:t>SQuaRE</w:t>
-      </w:r>
-      <w:proofErr w:type="spellEnd"/>
-      <w:r>
-        <w:rPr>
-          <w:rFonts w:ascii="Times New Roman" w:hAnsi="Times New Roman"/>
-          <w:i/>
-          <w:sz w:val="24"/>
-        </w:rPr>
-        <w:t>)—System and software quality models</w:t>
-      </w:r>
-      <w:r>
-        <w:rPr>
-          <w:rFonts w:ascii="Times New Roman" w:hAnsi="Times New Roman"/>
           <w:sz w:val="24"/>
         </w:rPr>
         <w:t xml:space="preserve"> (ISO/IEC Standard No. 25010:2011). </w:t>
       </w:r>
-      <w:hyperlink r:id="rId12" w:history="1">
+      <w:hyperlink r:id="rId13" w:history="1">
         <w:r>
           <w:rPr>
             <w:rStyle w:val="Hyperlink"/>
@@ -5780,69 +4848,12 @@
         <w:ind w:left="720" w:hanging="720"/>
         <w:jc w:val="both"/>
       </w:pPr>
-      <w:proofErr w:type="spellStart"/>
       <w:r>
         <w:rPr>
           <w:rFonts w:ascii="Times New Roman" w:hAnsi="Times New Roman"/>
           <w:sz w:val="24"/>
         </w:rPr>
-        <w:t>Jumao</w:t>
-      </w:r>
-      <w:proofErr w:type="spellEnd"/>
-      <w:r>
-        <w:rPr>
-          <w:rFonts w:ascii="Times New Roman" w:hAnsi="Times New Roman"/>
-          <w:sz w:val="24"/>
-        </w:rPr>
-        <w:t xml:space="preserve">-as, J., Fuentes, J. L., </w:t>
-      </w:r>
-      <w:proofErr w:type="spellStart"/>
-      <w:r>
-        <w:rPr>
-          <w:rFonts w:ascii="Times New Roman" w:hAnsi="Times New Roman"/>
-          <w:sz w:val="24"/>
-        </w:rPr>
-        <w:t>Lacar</w:t>
-      </w:r>
-      <w:proofErr w:type="spellEnd"/>
-      <w:r>
-        <w:rPr>
-          <w:rFonts w:ascii="Times New Roman" w:hAnsi="Times New Roman"/>
-          <w:sz w:val="24"/>
-        </w:rPr>
-        <w:t xml:space="preserve">, L., Fuertes, G. J., </w:t>
-      </w:r>
-      <w:proofErr w:type="spellStart"/>
-      <w:r>
-        <w:rPr>
-          <w:rFonts w:ascii="Times New Roman" w:hAnsi="Times New Roman"/>
-          <w:sz w:val="24"/>
-        </w:rPr>
-        <w:t>Erag</w:t>
-      </w:r>
-      <w:proofErr w:type="spellEnd"/>
-      <w:r>
-        <w:rPr>
-          <w:rFonts w:ascii="Times New Roman" w:hAnsi="Times New Roman"/>
-          <w:sz w:val="24"/>
-        </w:rPr>
-        <w:t xml:space="preserve">, C., &amp; </w:t>
-      </w:r>
-      <w:proofErr w:type="spellStart"/>
-      <w:r>
-        <w:rPr>
-          <w:rFonts w:ascii="Times New Roman" w:hAnsi="Times New Roman"/>
-          <w:sz w:val="24"/>
-        </w:rPr>
-        <w:t>Tagaylo</w:t>
-      </w:r>
-      <w:proofErr w:type="spellEnd"/>
-      <w:r>
-        <w:rPr>
-          <w:rFonts w:ascii="Times New Roman" w:hAnsi="Times New Roman"/>
-          <w:sz w:val="24"/>
-        </w:rPr>
-        <w:t xml:space="preserve">, C. (2025). Reading remediation program and Grade 4 pupils' reading comprehension. </w:t>
+        <w:t xml:space="preserve">Jumao-as, J., Fuentes, J. L., Lacar, L., Fuertes, G. J., Erag, C., &amp; Tagaylo, C. (2025). Reading remediation program and Grade 4 pupils' reading comprehension. </w:t>
       </w:r>
       <w:r>
         <w:rPr>
@@ -5859,7 +4870,7 @@
         </w:rPr>
         <w:t xml:space="preserve">(6), 365–377. </w:t>
       </w:r>
-      <w:hyperlink r:id="rId13" w:history="1">
+      <w:hyperlink r:id="rId14" w:history="1">
         <w:r>
           <w:rPr>
             <w:rStyle w:val="Hyperlink"/>
@@ -5905,7 +4916,7 @@
         </w:rPr>
         <w:t xml:space="preserve">. </w:t>
       </w:r>
-      <w:hyperlink r:id="rId14" w:history="1">
+      <w:hyperlink r:id="rId15" w:history="1">
         <w:r>
           <w:rPr>
             <w:rStyle w:val="Hyperlink"/>
@@ -5951,7 +4962,7 @@
         </w:rPr>
         <w:t xml:space="preserve">(2), Article 17. </w:t>
       </w:r>
-      <w:hyperlink r:id="rId15" w:history="1">
+      <w:hyperlink r:id="rId16" w:history="1">
         <w:r>
           <w:rPr>
             <w:rStyle w:val="Hyperlink"/>
@@ -5975,21 +4986,12 @@
         <w:ind w:left="720" w:hanging="720"/>
         <w:jc w:val="both"/>
       </w:pPr>
-      <w:proofErr w:type="spellStart"/>
       <w:r>
         <w:rPr>
           <w:rFonts w:ascii="Times New Roman" w:hAnsi="Times New Roman"/>
           <w:sz w:val="24"/>
         </w:rPr>
-        <w:t>Persky</w:t>
-      </w:r>
-      <w:proofErr w:type="spellEnd"/>
-      <w:r>
-        <w:rPr>
-          <w:rFonts w:ascii="Times New Roman" w:hAnsi="Times New Roman"/>
-          <w:sz w:val="24"/>
-        </w:rPr>
-        <w:t xml:space="preserve">, A. M., &amp; Hughes, M. L. (2022). A practical review of mastery learning. </w:t>
+        <w:t xml:space="preserve">Persky, A. M., &amp; Hughes, M. L. (2022). A practical review of mastery learning. </w:t>
       </w:r>
       <w:r>
         <w:rPr>
@@ -6006,7 +5008,7 @@
         </w:rPr>
         <w:t xml:space="preserve">(10), Article 8906. </w:t>
       </w:r>
-      <w:hyperlink r:id="rId16" w:history="1">
+      <w:hyperlink r:id="rId17" w:history="1">
         <w:r>
           <w:rPr>
             <w:rStyle w:val="Hyperlink"/>
@@ -6036,23 +5038,7 @@
           <w:sz w:val="24"/>
         </w:rPr>
         <w:lastRenderedPageBreak/>
-        <w:t xml:space="preserve">Ramesh, D., &amp; </w:t>
-      </w:r>
-      <w:proofErr w:type="spellStart"/>
-      <w:r>
-        <w:rPr>
-          <w:rFonts w:ascii="Times New Roman" w:hAnsi="Times New Roman"/>
-          <w:sz w:val="24"/>
-        </w:rPr>
-        <w:t>Sanampudi</w:t>
-      </w:r>
-      <w:proofErr w:type="spellEnd"/>
-      <w:r>
-        <w:rPr>
-          <w:rFonts w:ascii="Times New Roman" w:hAnsi="Times New Roman"/>
-          <w:sz w:val="24"/>
-        </w:rPr>
-        <w:t xml:space="preserve">, S. K. (2022). An automated essay scoring systems: A systematic literature review. </w:t>
+        <w:t xml:space="preserve">Ramesh, D., &amp; Sanampudi, S. K. (2022). An automated essay scoring systems: A systematic literature review. </w:t>
       </w:r>
       <w:r>
         <w:rPr>
@@ -6069,7 +5055,7 @@
         </w:rPr>
         <w:t xml:space="preserve">(3), 2495–2527. </w:t>
       </w:r>
-      <w:hyperlink r:id="rId17" w:history="1">
+      <w:hyperlink r:id="rId18" w:history="1">
         <w:r>
           <w:rPr>
             <w:rStyle w:val="Hyperlink"/>
@@ -6088,8 +5074,8 @@
       </w:r>
     </w:p>
     <w:sectPr>
-      <w:headerReference w:type="default" r:id="rId18"/>
-      <w:footerReference w:type="default" r:id="rId19"/>
+      <w:headerReference w:type="default" r:id="rId19"/>
+      <w:footerReference w:type="default" r:id="rId20"/>
       <w:pgSz w:w="12240" w:h="15840"/>
       <w:pgMar w:top="1440" w:right="1440" w:bottom="1440" w:left="2160" w:header="850" w:footer="1134" w:gutter="0"/>
       <w:pgNumType w:start="1"/>
@@ -6183,7 +5169,7 @@
         <w:sz w:val="24"/>
         <w:szCs w:val="24"/>
       </w:rPr>
-      <w:t>19</w:t>
+      <w:t>4</w:t>
     </w:r>
     <w:r>
       <w:rPr>
@@ -7003,6 +5989,18 @@
       <w:u w:val="single"/>
     </w:rPr>
   </w:style>
+  <w:style w:type="character" w:styleId="FollowedHyperlink">
+    <w:name w:val="FollowedHyperlink"/>
+    <w:basedOn w:val="DefaultParagraphFont"/>
+    <w:uiPriority w:val="99"/>
+    <w:semiHidden/>
+    <w:unhideWhenUsed/>
+    <w:rsid w:val="0098519B"/>
+    <w:rPr>
+      <w:color w:val="800080" w:themeColor="followedHyperlink"/>
+      <w:u w:val="single"/>
+    </w:rPr>
+  </w:style>
 </w:styles>
 </file>
 

</xml_diff>